<commit_message>
Quase fim de revisao
</commit_message>
<xml_diff>
--- a/ESTUDOS PYTHON.docx
+++ b/ESTUDOS PYTHON.docx
@@ -61,13 +61,8 @@
       </w:r>
     </w:p>
     <w:p>
-      <w:proofErr w:type="spellStart"/>
-      <w:r>
-        <w:t>Int</w:t>
-      </w:r>
-      <w:proofErr w:type="spellEnd"/>
-      <w:r>
-        <w:t xml:space="preserve"> == seria pra números inteiros. </w:t>
+      <w:r>
+        <w:t xml:space="preserve">Int == seria pra números inteiros. </w:t>
       </w:r>
     </w:p>
     <w:p>
@@ -173,46 +168,12 @@
           <w:bCs/>
         </w:rPr>
       </w:pPr>
-      <w:proofErr w:type="spellStart"/>
-      <w:proofErr w:type="gramStart"/>
-      <w:r>
-        <w:rPr>
-          <w:b/>
-          <w:bCs/>
-        </w:rPr>
-        <w:t>Pow</w:t>
-      </w:r>
-      <w:proofErr w:type="spellEnd"/>
-      <w:r>
-        <w:rPr>
-          <w:b/>
-          <w:bCs/>
-        </w:rPr>
-        <w:t>(</w:t>
-      </w:r>
-      <w:proofErr w:type="gramEnd"/>
-      <w:r>
-        <w:rPr>
-          <w:b/>
-          <w:bCs/>
-        </w:rPr>
-        <w:t xml:space="preserve">4,3)- </w:t>
-      </w:r>
-      <w:proofErr w:type="spellStart"/>
-      <w:r>
-        <w:rPr>
-          <w:b/>
-          <w:bCs/>
-        </w:rPr>
-        <w:t>potencia</w:t>
-      </w:r>
-      <w:proofErr w:type="spellEnd"/>
-      <w:r>
-        <w:rPr>
-          <w:b/>
-          <w:bCs/>
-        </w:rPr>
-        <w:t xml:space="preserve"> de 4 ao cubo.</w:t>
+      <w:r>
+        <w:rPr>
+          <w:b/>
+          <w:bCs/>
+        </w:rPr>
+        <w:t>Pow(4,3)- potencia de 4 ao cubo.</w:t>
       </w:r>
     </w:p>
     <w:p>
@@ -262,21 +223,12 @@
           <w:bCs/>
         </w:rPr>
       </w:pPr>
-      <w:proofErr w:type="spellStart"/>
-      <w:r>
-        <w:rPr>
-          <w:b/>
-          <w:bCs/>
-        </w:rPr>
-        <w:t>Divisao</w:t>
-      </w:r>
-      <w:proofErr w:type="spellEnd"/>
-      <w:r>
-        <w:rPr>
-          <w:b/>
-          <w:bCs/>
-        </w:rPr>
-        <w:t xml:space="preserve"> inteira = 19//2 seria apenas 9.</w:t>
+      <w:r>
+        <w:rPr>
+          <w:b/>
+          <w:bCs/>
+        </w:rPr>
+        <w:t>Divisao inteira = 19//2 seria apenas 9.</w:t>
       </w:r>
     </w:p>
     <w:p>
@@ -438,23 +390,7 @@
           <w:b/>
           <w:bCs/>
         </w:rPr>
-        <w:t xml:space="preserve">múltiplos </w:t>
-      </w:r>
-      <w:proofErr w:type="spellStart"/>
-      <w:r>
-        <w:rPr>
-          <w:b/>
-          <w:bCs/>
-        </w:rPr>
-        <w:t>strings</w:t>
-      </w:r>
-      <w:proofErr w:type="spellEnd"/>
-      <w:r>
-        <w:rPr>
-          <w:b/>
-          <w:bCs/>
-        </w:rPr>
-        <w:t xml:space="preserve"> colocando multiplicação:</w:t>
+        <w:t>múltiplos strings colocando multiplicação:</w:t>
       </w:r>
     </w:p>
     <w:p>
@@ -465,23 +401,13 @@
           <w:iCs/>
         </w:rPr>
       </w:pPr>
-      <w:proofErr w:type="gramStart"/>
       <w:r>
         <w:rPr>
           <w:bCs/>
           <w:i/>
           <w:iCs/>
         </w:rPr>
-        <w:t>Print(</w:t>
-      </w:r>
-      <w:proofErr w:type="gramEnd"/>
-      <w:r>
-        <w:rPr>
-          <w:bCs/>
-          <w:i/>
-          <w:iCs/>
-        </w:rPr>
-        <w:t>‘‘=’’*20)</w:t>
+        <w:t>Print(‘‘=’’*20)</w:t>
       </w:r>
     </w:p>
     <w:p>
@@ -504,33 +430,14 @@
           <w:szCs w:val="40"/>
           <w:u w:val="single"/>
         </w:rPr>
-        <w:t>{:=^</w:t>
-      </w:r>
-      <w:proofErr w:type="gramStart"/>
-      <w:r>
-        <w:rPr>
-          <w:i/>
-          <w:iCs/>
+        <w:t>{:=^20}</w:t>
+      </w:r>
+      <w:r>
+        <w:rPr>
           <w:sz w:val="40"/>
           <w:szCs w:val="40"/>
-          <w:u w:val="single"/>
-        </w:rPr>
-        <w:t>20}</w:t>
-      </w:r>
-      <w:r>
-        <w:rPr>
-          <w:sz w:val="40"/>
-          <w:szCs w:val="40"/>
-        </w:rPr>
-        <w:t>-</w:t>
-      </w:r>
-      <w:proofErr w:type="gramEnd"/>
-      <w:r>
-        <w:rPr>
-          <w:sz w:val="40"/>
-          <w:szCs w:val="40"/>
-        </w:rPr>
-        <w:t xml:space="preserve"> O QUE QUER DIZER ISSO?</w:t>
+        </w:rPr>
+        <w:t>- O QUE QUER DIZER ISSO?</w:t>
       </w:r>
     </w:p>
     <w:p>
@@ -586,23 +493,21 @@
           <w:numId w:val="5"/>
         </w:numPr>
       </w:pPr>
-      <w:proofErr w:type="gramStart"/>
       <w:r>
         <w:rPr>
           <w:b/>
           <w:sz w:val="24"/>
           <w:szCs w:val="24"/>
         </w:rPr>
-        <w:t>&gt;,&lt;</w:t>
-      </w:r>
-      <w:proofErr w:type="gramEnd"/>
+        <w:t>&gt;,&lt;,^</w:t>
+      </w:r>
       <w:r>
         <w:rPr>
           <w:b/>
           <w:sz w:val="24"/>
           <w:szCs w:val="24"/>
         </w:rPr>
-        <w:t>,^</w:t>
+        <w:t xml:space="preserve"> </w:t>
       </w:r>
       <w:r>
         <w:rPr>
@@ -610,7 +515,7 @@
           <w:sz w:val="24"/>
           <w:szCs w:val="24"/>
         </w:rPr>
-        <w:t xml:space="preserve"> </w:t>
+        <w:sym w:font="Wingdings" w:char="F0E0"/>
       </w:r>
       <w:r>
         <w:rPr>
@@ -618,38 +523,14 @@
           <w:sz w:val="24"/>
           <w:szCs w:val="24"/>
         </w:rPr>
-        <w:sym w:font="Wingdings" w:char="F0E0"/>
-      </w:r>
-      <w:r>
-        <w:rPr>
-          <w:b/>
+        <w:t xml:space="preserve"> </w:t>
+      </w:r>
+      <w:r>
+        <w:rPr>
           <w:sz w:val="24"/>
           <w:szCs w:val="24"/>
         </w:rPr>
-        <w:t xml:space="preserve"> </w:t>
-      </w:r>
-      <w:r>
-        <w:rPr>
-          <w:sz w:val="24"/>
-          <w:szCs w:val="24"/>
-        </w:rPr>
-        <w:t xml:space="preserve">Alinhado </w:t>
-      </w:r>
-      <w:proofErr w:type="spellStart"/>
-      <w:r>
-        <w:rPr>
-          <w:sz w:val="24"/>
-          <w:szCs w:val="24"/>
-        </w:rPr>
-        <w:t>a</w:t>
-      </w:r>
-      <w:proofErr w:type="spellEnd"/>
-      <w:r>
-        <w:rPr>
-          <w:sz w:val="24"/>
-          <w:szCs w:val="24"/>
-        </w:rPr>
-        <w:t xml:space="preserve"> direita, esquerda e centralizado (respectivamente).</w:t>
+        <w:t>Alinhado a direita, esquerda e centralizado (respectivamente).</w:t>
       </w:r>
     </w:p>
     <w:p>
@@ -760,15 +641,7 @@
         </w:numPr>
       </w:pPr>
       <w:r>
-        <w:t xml:space="preserve">, </w:t>
-      </w:r>
-      <w:proofErr w:type="spellStart"/>
-      <w:r>
-        <w:t>end</w:t>
-      </w:r>
-      <w:proofErr w:type="spellEnd"/>
-      <w:r>
-        <w:t>=’ ‘</w:t>
+        <w:t>, end=’ ‘</w:t>
       </w:r>
       <w:r>
         <w:sym w:font="Wingdings" w:char="F0E0"/>
@@ -815,55 +688,7 @@
     </w:p>
     <w:p>
       <w:r>
-        <w:t>Pra importar bibliotecas, a gente usa o “</w:t>
-      </w:r>
-      <w:proofErr w:type="spellStart"/>
-      <w:r>
-        <w:t>import</w:t>
-      </w:r>
-      <w:proofErr w:type="spellEnd"/>
-      <w:r>
-        <w:t>”. Posso importar algo apenas, usando “</w:t>
-      </w:r>
-      <w:proofErr w:type="spellStart"/>
-      <w:r>
-        <w:t>from</w:t>
-      </w:r>
-      <w:proofErr w:type="spellEnd"/>
-      <w:r>
-        <w:t xml:space="preserve"> </w:t>
-      </w:r>
-      <w:proofErr w:type="spellStart"/>
-      <w:r>
-        <w:t>math</w:t>
-      </w:r>
-      <w:proofErr w:type="spellEnd"/>
-      <w:r>
-        <w:t xml:space="preserve"> </w:t>
-      </w:r>
-      <w:proofErr w:type="spellStart"/>
-      <w:r>
-        <w:t>import</w:t>
-      </w:r>
-      <w:proofErr w:type="spellEnd"/>
-      <w:r>
-        <w:t xml:space="preserve"> </w:t>
-      </w:r>
-      <w:proofErr w:type="spellStart"/>
-      <w:r>
-        <w:t>ceil</w:t>
-      </w:r>
-      <w:proofErr w:type="spellEnd"/>
-      <w:r>
-        <w:t xml:space="preserve">, </w:t>
-      </w:r>
-      <w:proofErr w:type="spellStart"/>
-      <w:r>
-        <w:t>floor</w:t>
-      </w:r>
-      <w:proofErr w:type="spellEnd"/>
-      <w:r>
-        <w:t>”</w:t>
+        <w:t>Pra importar bibliotecas, a gente usa o “import”. Posso importar algo apenas, usando “from math import ceil, floor”</w:t>
       </w:r>
     </w:p>
     <w:p>
@@ -874,13 +699,8 @@
           <w:numId w:val="8"/>
         </w:numPr>
       </w:pPr>
-      <w:proofErr w:type="spellStart"/>
-      <w:r>
-        <w:t>Ceil</w:t>
-      </w:r>
-      <w:proofErr w:type="spellEnd"/>
-      <w:r>
-        <w:t xml:space="preserve"> </w:t>
+      <w:r>
+        <w:t xml:space="preserve">Ceil </w:t>
       </w:r>
       <w:r>
         <w:sym w:font="Wingdings" w:char="F0E0"/>
@@ -897,11 +717,9 @@
           <w:numId w:val="8"/>
         </w:numPr>
       </w:pPr>
-      <w:proofErr w:type="spellStart"/>
       <w:r>
         <w:t>Floor</w:t>
       </w:r>
-      <w:proofErr w:type="spellEnd"/>
       <w:r>
         <w:sym w:font="Wingdings" w:char="F0E0"/>
       </w:r>
@@ -917,11 +735,9 @@
           <w:numId w:val="8"/>
         </w:numPr>
       </w:pPr>
-      <w:proofErr w:type="spellStart"/>
       <w:r>
         <w:t>Pow</w:t>
       </w:r>
-      <w:proofErr w:type="spellEnd"/>
       <w:r>
         <w:sym w:font="Wingdings" w:char="F0E0"/>
       </w:r>
@@ -937,11 +753,9 @@
           <w:numId w:val="8"/>
         </w:numPr>
       </w:pPr>
-      <w:proofErr w:type="spellStart"/>
       <w:r>
         <w:t>Sqrt</w:t>
       </w:r>
-      <w:proofErr w:type="spellEnd"/>
       <w:r>
         <w:sym w:font="Wingdings" w:char="F0E0"/>
       </w:r>
@@ -957,11 +771,9 @@
           <w:numId w:val="8"/>
         </w:numPr>
       </w:pPr>
-      <w:proofErr w:type="spellStart"/>
       <w:r>
         <w:t>Factorial</w:t>
       </w:r>
-      <w:proofErr w:type="spellEnd"/>
       <w:r>
         <w:sym w:font="Wingdings" w:char="F0E0"/>
       </w:r>
@@ -994,17 +806,7 @@
         <w:ind w:left="360"/>
       </w:pPr>
       <w:r>
-        <w:t xml:space="preserve">N1= </w:t>
-      </w:r>
-      <w:proofErr w:type="spellStart"/>
-      <w:proofErr w:type="gramStart"/>
-      <w:r>
-        <w:t>math.function</w:t>
-      </w:r>
-      <w:proofErr w:type="spellEnd"/>
-      <w:proofErr w:type="gramEnd"/>
-      <w:r>
-        <w:t>(x)</w:t>
+        <w:t>N1= math.function(x)</w:t>
       </w:r>
     </w:p>
     <w:p>
@@ -1020,104 +822,21 @@
           <w:b/>
           <w:i/>
         </w:rPr>
-        <w:t xml:space="preserve">Se eu importar </w:t>
-      </w:r>
-      <w:proofErr w:type="spellStart"/>
-      <w:r>
-        <w:rPr>
-          <w:b/>
+        <w:t xml:space="preserve">Se eu importar so uma função, não preciso usar o math.”função”, posso usar direto só a função. </w:t>
+      </w:r>
+    </w:p>
+    <w:p>
+      <w:pPr>
+        <w:ind w:left="360"/>
+        <w:rPr>
           <w:i/>
         </w:rPr>
-        <w:t>so</w:t>
-      </w:r>
-      <w:proofErr w:type="spellEnd"/>
-      <w:r>
-        <w:rPr>
-          <w:b/>
+      </w:pPr>
+      <w:r>
+        <w:rPr>
           <w:i/>
         </w:rPr>
-        <w:t xml:space="preserve"> uma função, não preciso usar o </w:t>
-      </w:r>
-      <w:proofErr w:type="spellStart"/>
-      <w:r>
-        <w:rPr>
-          <w:b/>
-          <w:i/>
-        </w:rPr>
-        <w:t>math</w:t>
-      </w:r>
-      <w:proofErr w:type="spellEnd"/>
-      <w:proofErr w:type="gramStart"/>
-      <w:r>
-        <w:rPr>
-          <w:b/>
-          <w:i/>
-        </w:rPr>
-        <w:t>.”função</w:t>
-      </w:r>
-      <w:proofErr w:type="gramEnd"/>
-      <w:r>
-        <w:rPr>
-          <w:b/>
-          <w:i/>
-        </w:rPr>
-        <w:t xml:space="preserve">”, posso usar direto só a função. </w:t>
-      </w:r>
-    </w:p>
-    <w:p>
-      <w:pPr>
-        <w:ind w:left="360"/>
-        <w:rPr>
-          <w:i/>
-        </w:rPr>
-      </w:pPr>
-      <w:r>
-        <w:rPr>
-          <w:i/>
-        </w:rPr>
-        <w:t xml:space="preserve">Por </w:t>
-      </w:r>
-      <w:proofErr w:type="spellStart"/>
-      <w:r>
-        <w:rPr>
-          <w:i/>
-        </w:rPr>
-        <w:t>ex</w:t>
-      </w:r>
-      <w:proofErr w:type="spellEnd"/>
-      <w:r>
-        <w:rPr>
-          <w:i/>
-        </w:rPr>
-        <w:t xml:space="preserve">: </w:t>
-      </w:r>
-      <w:proofErr w:type="spellStart"/>
-      <w:r>
-        <w:rPr>
-          <w:i/>
-        </w:rPr>
-        <w:t>potenciadeN</w:t>
-      </w:r>
-      <w:proofErr w:type="spellEnd"/>
-      <w:r>
-        <w:rPr>
-          <w:i/>
-        </w:rPr>
-        <w:t xml:space="preserve"> = </w:t>
-      </w:r>
-      <w:proofErr w:type="spellStart"/>
-      <w:r>
-        <w:rPr>
-          <w:i/>
-        </w:rPr>
-        <w:t>pow</w:t>
-      </w:r>
-      <w:proofErr w:type="spellEnd"/>
-      <w:r>
-        <w:rPr>
-          <w:i/>
-        </w:rPr>
-        <w:t>(N)</w:t>
+        <w:t>Por ex: potenciadeN = pow(N)</w:t>
       </w:r>
     </w:p>
     <w:p>
@@ -1242,21 +961,7 @@
         <w:rPr>
           <w:b/>
         </w:rPr>
-        <w:t>Uso o k=n (</w:t>
-      </w:r>
-      <w:proofErr w:type="spellStart"/>
-      <w:r>
-        <w:rPr>
-          <w:b/>
-        </w:rPr>
-        <w:t>numero</w:t>
-      </w:r>
-      <w:proofErr w:type="spellEnd"/>
-      <w:r>
-        <w:rPr>
-          <w:b/>
-        </w:rPr>
-        <w:t xml:space="preserve"> de escolhas)</w:t>
+        <w:t>Uso o k=n (numero de escolhas)</w:t>
       </w:r>
     </w:p>
     <w:p>
@@ -1270,27 +975,17 @@
           <w:b/>
         </w:rPr>
       </w:pPr>
-      <w:proofErr w:type="gramStart"/>
       <w:r>
         <w:rPr>
           <w:b/>
         </w:rPr>
         <w:t>.</w:t>
       </w:r>
-      <w:proofErr w:type="spellStart"/>
-      <w:r>
-        <w:rPr>
-          <w:b/>
-        </w:rPr>
-        <w:t>join</w:t>
-      </w:r>
-      <w:proofErr w:type="spellEnd"/>
-      <w:proofErr w:type="gramEnd"/>
-      <w:r>
-        <w:rPr>
-          <w:b/>
-        </w:rPr>
-        <w:t xml:space="preserve"> junta variáveis </w:t>
+      <w:r>
+        <w:rPr>
+          <w:b/>
+        </w:rPr>
+        <w:t xml:space="preserve">join junta variáveis </w:t>
       </w:r>
     </w:p>
     <w:p>
@@ -1305,20 +1000,7 @@
         </w:rPr>
       </w:pPr>
       <w:r>
-        <w:t>Defino antes dela o que vai ter ENTRE as variáveis. {‘e</w:t>
-      </w:r>
-      <w:proofErr w:type="gramStart"/>
-      <w:r>
-        <w:t>’.</w:t>
-      </w:r>
-      <w:proofErr w:type="spellStart"/>
-      <w:r>
-        <w:t>join</w:t>
-      </w:r>
-      <w:proofErr w:type="spellEnd"/>
-      <w:proofErr w:type="gramEnd"/>
-      <w:r>
-        <w:t>(n)}. Se ficar assim fica colado um no outro. Tenho que por espaço antes e depois do ‘e’.</w:t>
+        <w:t>Defino antes dela o que vai ter ENTRE as variáveis. {‘e’.join(n)}. Se ficar assim fica colado um no outro. Tenho que por espaço antes e depois do ‘e’.</w:t>
       </w:r>
     </w:p>
     <w:p>
@@ -1332,33 +1014,14 @@
           <w:b/>
         </w:rPr>
       </w:pPr>
-      <w:proofErr w:type="spellStart"/>
-      <w:r>
-        <w:rPr>
-          <w:b/>
-        </w:rPr>
-        <w:t>Ramdom.sample</w:t>
-      </w:r>
-      <w:proofErr w:type="spellEnd"/>
-      <w:r>
-        <w:rPr>
-          <w:b/>
-        </w:rPr>
-        <w:t>(alunos, k=</w:t>
-      </w:r>
-      <w:proofErr w:type="gramStart"/>
-      <w:r>
-        <w:rPr>
-          <w:b/>
-        </w:rPr>
-        <w:t>4)</w:t>
-      </w:r>
-      <w:r>
-        <w:t>-</w:t>
-      </w:r>
-      <w:proofErr w:type="gramEnd"/>
-      <w:r>
-        <w:t xml:space="preserve"> ele seleciona limitando quantos selecionados eu quero no k</w:t>
+      <w:r>
+        <w:rPr>
+          <w:b/>
+        </w:rPr>
+        <w:t>Ramdom.sample(alunos, k=4)</w:t>
+      </w:r>
+      <w:r>
+        <w:t>- ele seleciona limitando quantos selecionados eu quero no k</w:t>
       </w:r>
     </w:p>
     <w:p>
@@ -1372,19 +1035,11 @@
           <w:b/>
         </w:rPr>
       </w:pPr>
-      <w:proofErr w:type="spellStart"/>
-      <w:r>
-        <w:rPr>
-          <w:b/>
-        </w:rPr>
-        <w:t>Ramdom.shuffle</w:t>
-      </w:r>
-      <w:proofErr w:type="spellEnd"/>
-      <w:r>
-        <w:rPr>
-          <w:b/>
-        </w:rPr>
-        <w:t>(alunos)</w:t>
+      <w:r>
+        <w:rPr>
+          <w:b/>
+        </w:rPr>
+        <w:t>Ramdom.shuffle(alunos)</w:t>
       </w:r>
       <w:r>
         <w:rPr>
@@ -1393,15 +1048,7 @@
         <w:sym w:font="Wingdings" w:char="F0E0"/>
       </w:r>
       <w:r>
-        <w:t xml:space="preserve">Ele </w:t>
-      </w:r>
-      <w:proofErr w:type="spellStart"/>
-      <w:r>
-        <w:t>so</w:t>
-      </w:r>
-      <w:proofErr w:type="spellEnd"/>
-      <w:r>
-        <w:t xml:space="preserve"> embaralha, todos. </w:t>
+        <w:t xml:space="preserve">Ele so embaralha, todos. </w:t>
       </w:r>
     </w:p>
     <w:p>
@@ -1479,19 +1126,11 @@
           <w:numId w:val="12"/>
         </w:numPr>
       </w:pPr>
-      <w:proofErr w:type="spellStart"/>
-      <w:r>
-        <w:rPr>
-          <w:b/>
-        </w:rPr>
-        <w:t>Frase.count</w:t>
-      </w:r>
-      <w:proofErr w:type="spellEnd"/>
-      <w:r>
-        <w:rPr>
-          <w:b/>
-        </w:rPr>
-        <w:t>(‘letra’)</w:t>
+      <w:r>
+        <w:rPr>
+          <w:b/>
+        </w:rPr>
+        <w:t>Frase.count(‘letra’)</w:t>
       </w:r>
       <w:r>
         <w:sym w:font="Wingdings" w:char="F0E0"/>
@@ -1514,14 +1153,12 @@
           <w:numId w:val="12"/>
         </w:numPr>
       </w:pPr>
-      <w:proofErr w:type="spellStart"/>
       <w:r>
         <w:rPr>
           <w:b/>
         </w:rPr>
         <w:t>Frase.replace</w:t>
       </w:r>
-      <w:proofErr w:type="spellEnd"/>
       <w:r>
         <w:rPr>
           <w:b/>
@@ -1565,37 +1202,7 @@
         <w:rPr>
           <w:b/>
         </w:rPr>
-        <w:t>Print(</w:t>
-      </w:r>
-      <w:proofErr w:type="spellStart"/>
-      <w:proofErr w:type="gramStart"/>
-      <w:r>
-        <w:rPr>
-          <w:b/>
-        </w:rPr>
-        <w:t>frase.upper</w:t>
-      </w:r>
-      <w:proofErr w:type="spellEnd"/>
-      <w:proofErr w:type="gramEnd"/>
-      <w:r>
-        <w:rPr>
-          <w:b/>
-        </w:rPr>
-        <w:t>().</w:t>
-      </w:r>
-      <w:proofErr w:type="spellStart"/>
-      <w:r>
-        <w:rPr>
-          <w:b/>
-        </w:rPr>
-        <w:t>count</w:t>
-      </w:r>
-      <w:proofErr w:type="spellEnd"/>
-      <w:r>
-        <w:rPr>
-          <w:b/>
-        </w:rPr>
-        <w:t>(‘O’))</w:t>
+        <w:t>Print(frase.upper().count(‘O’))</w:t>
       </w:r>
       <w:r>
         <w:rPr>
@@ -1610,15 +1217,7 @@
         <w:t xml:space="preserve"> </w:t>
       </w:r>
       <w:r>
-        <w:t xml:space="preserve">Nesse caso ele coloca em </w:t>
-      </w:r>
-      <w:proofErr w:type="spellStart"/>
-      <w:r>
-        <w:t>maiusculo</w:t>
-      </w:r>
-      <w:proofErr w:type="spellEnd"/>
-      <w:r>
-        <w:t xml:space="preserve"> primeiro, depois faz</w:t>
+        <w:t>Nesse caso ele coloca em maiusculo primeiro, depois faz</w:t>
       </w:r>
     </w:p>
     <w:p>
@@ -1629,13 +1228,8 @@
           <w:numId w:val="12"/>
         </w:numPr>
       </w:pPr>
-      <w:proofErr w:type="spellStart"/>
-      <w:r>
-        <w:t>Frase.split</w:t>
-      </w:r>
-      <w:proofErr w:type="spellEnd"/>
-      <w:r>
-        <w:t>()</w:t>
+      <w:r>
+        <w:t>Frase.split()</w:t>
       </w:r>
       <w:r>
         <w:sym w:font="Wingdings" w:char="F0E0"/>
@@ -2039,21 +1633,8 @@
           <w:b/>
         </w:rPr>
       </w:pPr>
-      <w:proofErr w:type="spellStart"/>
-      <w:r>
-        <w:t>Ex</w:t>
-      </w:r>
-      <w:proofErr w:type="spellEnd"/>
-      <w:r>
-        <w:t xml:space="preserve"> de estrutura:  for c in </w:t>
-      </w:r>
-      <w:proofErr w:type="gramStart"/>
-      <w:r>
-        <w:t>range(</w:t>
-      </w:r>
-      <w:proofErr w:type="gramEnd"/>
-      <w:r>
-        <w:t>1 , 6)</w:t>
+      <w:r>
+        <w:t>Ex de estrutura:  for c in range(1 , 6)</w:t>
       </w:r>
     </w:p>
     <w:p>
@@ -2136,6 +1717,9 @@
         </w:rPr>
       </w:pPr>
       <w:r>
+        <w:rPr>
+          <w:noProof/>
+        </w:rPr>
         <w:drawing>
           <wp:inline distT="0" distB="0" distL="0" distR="0" wp14:anchorId="48DCCA59" wp14:editId="7CEF3652">
             <wp:extent cx="6645910" cy="3547110"/>
@@ -2178,6 +1762,34 @@
           <w:b/>
         </w:rPr>
       </w:pPr>
+    </w:p>
+    <w:p>
+      <w:pPr>
+        <w:rPr>
+          <w:b/>
+        </w:rPr>
+      </w:pPr>
+      <w:r>
+        <w:rPr>
+          <w:b/>
+        </w:rPr>
+        <w:t>WHILE- LAÇOS 2</w:t>
+      </w:r>
+    </w:p>
+    <w:p>
+      <w:r>
+        <w:t xml:space="preserve">É estrutura de condição, enquanto algo não acontece, faça algo. </w:t>
+      </w:r>
+    </w:p>
+    <w:p>
+      <w:r>
+        <w:t>While c&gt;10:</w:t>
+      </w:r>
+    </w:p>
+    <w:p>
+      <w:r>
+        <w:t xml:space="preserve">    Print (c)</w:t>
+      </w:r>
     </w:p>
     <w:sectPr>
       <w:pgSz w:w="11906" w:h="16838"/>

</xml_diff>